<commit_message>
fix: remove manifest label from player
</commit_message>
<xml_diff>
--- a/docs/final-report.docx
+++ b/docs/final-report.docx
@@ -401,7 +401,7 @@
           <w:sz-cs w:val="24"/>
           <w:spacing w:val="0"/>
         </w:rPr>
-        <w:t xml:space="preserve">. I kept the manifest path visible in the page because it helps during demo and debugging. It clearly shows that the player is loading the expected DASH manifest.</w:t>
+        <w:t xml:space="preserve">. The page keeps the UI simple and only shows the video player plus debug logs that are useful during validation.</w:t>
       </w:r>
     </w:p>
     <w:p>
@@ -416,27 +416,7 @@
           <w:b/>
           <w:spacing w:val="0"/>
         </w:rPr>
-        <w:t xml:space="preserve">[INSERT SCREENSHOT: dash.js player page showing the video and manifest </w:t>
-      </w:r>
-      <w:r>
-        <w:rPr>
-          <w:rFonts w:ascii="Menlo" w:hAnsi="Menlo" w:cs="Menlo"/>
-          <w:sz w:val="24"/>
-          <w:sz-cs w:val="24"/>
-          <w:b/>
-          <w:spacing w:val="0"/>
-        </w:rPr>
-        <w:t xml:space="preserve">/dash/live.mpd</w:t>
-      </w:r>
-      <w:r>
-        <w:rPr>
-          <w:rFonts w:ascii="Arial" w:hAnsi="Arial" w:cs="Arial"/>
-          <w:sz w:val="24"/>
-          <w:sz-cs w:val="24"/>
-          <w:b/>
-          <w:spacing w:val="0"/>
-        </w:rPr>
-        <w:t xml:space="preserve">]</w:t>
+        <w:t xml:space="preserve">[INSERT SCREENSHOT: dash.js player page showing the video playback]</w:t>
       </w:r>
       <w:r>
         <w:rPr>

</xml_diff>

<commit_message>
docs: finalize report, update figures, formatting, and add QR monitor disclosure
</commit_message>
<xml_diff>
--- a/docs/final-report.docx
+++ b/docs/final-report.docx
@@ -1,6 +1,6 @@
 
 <file path=word/document.xml><?xml version="1.0" encoding="utf-8"?>
-<w:document xmlns:w="http://schemas.openxmlformats.org/wordprocessingml/2006/main" xmlns:r="http://schemas.openxmlformats.org/officeDocument/2006/relationships" xmlns:wp="http://schemas.openxmlformats.org/drawingml/2006/wordprocessingDrawing" xmlns:a="http://schemas.openxmlformats.org/drawingml/2006/main" xmlns:pic="http://schemas.openxmlformats.org/drawingml/2006/picture">
+<w:document xmlns:a="http://schemas.openxmlformats.org/drawingml/2006/main" xmlns:pic="http://schemas.openxmlformats.org/drawingml/2006/picture" xmlns:r="http://schemas.openxmlformats.org/officeDocument/2006/relationships" xmlns:w="http://schemas.openxmlformats.org/wordprocessingml/2006/main" xmlns:wp="http://schemas.openxmlformats.org/drawingml/2006/wordprocessingDrawing">
   <w:body>
     <w:p>
       <w:pPr>
@@ -4391,32 +4391,23 @@
       </w:r>
     </w:p>
     <w:p>
-      <w:pPr>
-        <w:spacing w:after="140"/>
-      </w:pPr>
       <w:r>
         <w:t xml:space="preserve">I also implemented an optional QR timestamp overlay. It generates a QR payload in this format:</w:t>
       </w:r>
     </w:p>
     <w:p>
-      <w:pPr>
-        <w:pStyle w:val="Code"/>
-        <w:spacing w:after="160"/>
-      </w:pPr>
-      <w:r>
-        <w:rPr>
-          <w:rFonts w:ascii="Consolas" w:hAnsi="Consolas"/>
-          <w:sz w:val="19"/>
-        </w:rPr>
+      <w:r>
         <w:t xml:space="preserve">cs418-project3-ts=&lt;ISO timestamp&gt;</w:t>
       </w:r>
     </w:p>
     <w:p>
-      <w:pPr>
-        <w:spacing w:after="140"/>
-      </w:pPr>
-      <w:r>
-        <w:t xml:space="preserve">This can be added to OBS as a Browser Source. The helper code and tests for QR timestamp formatting and latency subtraction are included. However, I did not complete a real QR decode measurement from the received video frame. Because of that, I am not using QR latency as the required validation result. The required validation result in this report is still the wall-clock overlay measurement.</w:t>
+      <w:r>
+        <w:t xml:space="preserve">The overlay can be added to OBS as a Browser Source. The current implementation serves the QR generator locally from public/qrcode.bundle, so the overlay does not depend on a remote CDN during the live demo. I also extended the browser player with a QR-Based Latency Monitor panel. That panel samples frames from the HTML5 video element into an offscreen canvas, uses the jsQR browser library to decode the timestamp payload when the QR code is visible, and displays the latency computed from the decoded timestamp and the player-side system clock.</w:t>
+      </w:r>
+    </w:p>
+    <w:p>
+      <w:r>
+        <w:t xml:space="preserve">This QR path is implemented as a bonus aid and is separate from the required wall-clock validation. I did not complete a separately recorded, validated QR latency measurement for the report, so I am not using QR latency as the required validation result. The required validation result in this report is still the wall-clock overlay measurement.</w:t>
       </w:r>
     </w:p>
     <w:p>

</xml_diff>